<commit_message>
Add vibrating screen calculator and PDF generation
</commit_message>
<xml_diff>
--- a/backend/templates/Bearing Report.docx
+++ b/backend/templates/Bearing Report.docx
@@ -228,25 +228,7 @@
                 <w:sz w:val="24"/>
                 <w:szCs w:val="24"/>
               </w:rPr>
-              <w:t>{{</w:t>
-            </w:r>
-            <w:proofErr w:type="spellStart"/>
-            <w:r>
-              <w:rPr>
-                <w:rFonts w:ascii="Aptos" w:hAnsi="Aptos"/>
-                <w:sz w:val="24"/>
-                <w:szCs w:val="24"/>
-              </w:rPr>
-              <w:t>bearing_type</w:t>
-            </w:r>
-            <w:proofErr w:type="spellEnd"/>
-            <w:r>
-              <w:rPr>
-                <w:rFonts w:ascii="Aptos" w:hAnsi="Aptos"/>
-                <w:sz w:val="24"/>
-                <w:szCs w:val="24"/>
-              </w:rPr>
-              <w:t>}}</w:t>
+              <w:t>{{bearing_type}}</w:t>
             </w:r>
           </w:p>
         </w:tc>
@@ -322,25 +304,7 @@
                 <w:sz w:val="24"/>
                 <w:szCs w:val="24"/>
               </w:rPr>
-              <w:t>{{</w:t>
-            </w:r>
-            <w:proofErr w:type="spellStart"/>
-            <w:r>
-              <w:rPr>
-                <w:rFonts w:ascii="Aptos" w:hAnsi="Aptos"/>
-                <w:sz w:val="24"/>
-                <w:szCs w:val="24"/>
-              </w:rPr>
-              <w:t>number_of_rows</w:t>
-            </w:r>
-            <w:proofErr w:type="spellEnd"/>
-            <w:r>
-              <w:rPr>
-                <w:rFonts w:ascii="Aptos" w:hAnsi="Aptos"/>
-                <w:sz w:val="24"/>
-                <w:szCs w:val="24"/>
-              </w:rPr>
-              <w:t>}}</w:t>
+              <w:t>{{number_of_rows}}</w:t>
             </w:r>
           </w:p>
         </w:tc>
@@ -359,7 +323,6 @@
                 <w:szCs w:val="24"/>
               </w:rPr>
             </w:pPr>
-            <w:proofErr w:type="spellStart"/>
             <w:r>
               <w:rPr>
                 <w:rFonts w:ascii="Aptos" w:hAnsi="Aptos"/>
@@ -370,7 +333,6 @@
               </w:rPr>
               <w:t>i</w:t>
             </w:r>
-            <w:proofErr w:type="spellEnd"/>
           </w:p>
         </w:tc>
         <w:tc>
@@ -430,25 +392,7 @@
                 <w:sz w:val="24"/>
                 <w:szCs w:val="24"/>
               </w:rPr>
-              <w:t>{{</w:t>
-            </w:r>
-            <w:proofErr w:type="spellStart"/>
-            <w:r>
-              <w:rPr>
-                <w:rFonts w:ascii="Aptos" w:hAnsi="Aptos"/>
-                <w:sz w:val="24"/>
-                <w:szCs w:val="24"/>
-              </w:rPr>
-              <w:t>ball_diameter</w:t>
-            </w:r>
-            <w:proofErr w:type="spellEnd"/>
-            <w:r>
-              <w:rPr>
-                <w:rFonts w:ascii="Aptos" w:hAnsi="Aptos"/>
-                <w:sz w:val="24"/>
-                <w:szCs w:val="24"/>
-              </w:rPr>
-              <w:t>}}</w:t>
+              <w:t>{{ball_diameter}}</w:t>
             </w:r>
           </w:p>
         </w:tc>
@@ -467,7 +411,6 @@
                 <w:szCs w:val="24"/>
               </w:rPr>
             </w:pPr>
-            <w:proofErr w:type="spellStart"/>
             <w:r>
               <w:rPr>
                 <w:rFonts w:ascii="Aptos" w:hAnsi="Aptos"/>
@@ -478,7 +421,6 @@
               </w:rPr>
               <w:t>Dw</w:t>
             </w:r>
-            <w:proofErr w:type="spellEnd"/>
           </w:p>
         </w:tc>
         <w:tc>
@@ -546,25 +488,7 @@
                 <w:sz w:val="24"/>
                 <w:szCs w:val="24"/>
               </w:rPr>
-              <w:t>{{</w:t>
-            </w:r>
-            <w:proofErr w:type="spellStart"/>
-            <w:r>
-              <w:rPr>
-                <w:rFonts w:ascii="Aptos" w:hAnsi="Aptos"/>
-                <w:sz w:val="24"/>
-                <w:szCs w:val="24"/>
-              </w:rPr>
-              <w:t>radial_load</w:t>
-            </w:r>
-            <w:proofErr w:type="spellEnd"/>
-            <w:r>
-              <w:rPr>
-                <w:rFonts w:ascii="Aptos" w:hAnsi="Aptos"/>
-                <w:sz w:val="24"/>
-                <w:szCs w:val="24"/>
-              </w:rPr>
-              <w:t>}}</w:t>
+              <w:t>{{radial_load}}</w:t>
             </w:r>
           </w:p>
         </w:tc>
@@ -660,25 +584,7 @@
                 <w:sz w:val="24"/>
                 <w:szCs w:val="24"/>
               </w:rPr>
-              <w:t>{{</w:t>
-            </w:r>
-            <w:proofErr w:type="spellStart"/>
-            <w:r>
-              <w:rPr>
-                <w:rFonts w:ascii="Aptos" w:hAnsi="Aptos"/>
-                <w:sz w:val="24"/>
-                <w:szCs w:val="24"/>
-              </w:rPr>
-              <w:t>axial_load</w:t>
-            </w:r>
-            <w:proofErr w:type="spellEnd"/>
-            <w:r>
-              <w:rPr>
-                <w:rFonts w:ascii="Aptos" w:hAnsi="Aptos"/>
-                <w:sz w:val="24"/>
-                <w:szCs w:val="24"/>
-              </w:rPr>
-              <w:t>}}</w:t>
+              <w:t>{{axial_load}}</w:t>
             </w:r>
           </w:p>
         </w:tc>
@@ -886,25 +792,7 @@
                 <w:sz w:val="24"/>
                 <w:szCs w:val="24"/>
               </w:rPr>
-              <w:t>{{</w:t>
-            </w:r>
-            <w:proofErr w:type="spellStart"/>
-            <w:r>
-              <w:rPr>
-                <w:rFonts w:ascii="Aptos" w:hAnsi="Aptos"/>
-                <w:sz w:val="24"/>
-                <w:szCs w:val="24"/>
-              </w:rPr>
-              <w:t>required_life</w:t>
-            </w:r>
-            <w:proofErr w:type="spellEnd"/>
-            <w:r>
-              <w:rPr>
-                <w:rFonts w:ascii="Aptos" w:hAnsi="Aptos"/>
-                <w:sz w:val="24"/>
-                <w:szCs w:val="24"/>
-              </w:rPr>
-              <w:t>}}</w:t>
+              <w:t>{{required_life}}</w:t>
             </w:r>
           </w:p>
         </w:tc>
@@ -923,7 +811,6 @@
                 <w:szCs w:val="24"/>
               </w:rPr>
             </w:pPr>
-            <w:proofErr w:type="spellStart"/>
             <w:r>
               <w:rPr>
                 <w:rFonts w:ascii="Aptos" w:hAnsi="Aptos"/>
@@ -944,7 +831,6 @@
               </w:rPr>
               <w:t>h</w:t>
             </w:r>
-            <w:proofErr w:type="spellEnd"/>
           </w:p>
         </w:tc>
         <w:tc>
@@ -1035,7 +921,6 @@
         </w:rPr>
         <w:t>Size factor (</w:t>
       </w:r>
-      <w:proofErr w:type="gramStart"/>
       <w:r>
         <w:rPr>
           <w:rFonts w:asciiTheme="majorHAnsi" w:hAnsiTheme="majorHAnsi"/>
@@ -1060,16 +945,7 @@
           <w:sz w:val="24"/>
           <w:szCs w:val="24"/>
         </w:rPr>
-        <w:t xml:space="preserve"> </w:t>
-      </w:r>
-      <w:proofErr w:type="gramEnd"/>
-      <w:r>
-        <w:rPr>
-          <w:rFonts w:asciiTheme="majorHAnsi" w:hAnsiTheme="majorHAnsi"/>
-          <w:sz w:val="24"/>
-          <w:szCs w:val="24"/>
-        </w:rPr>
-        <w:t xml:space="preserve">      </w:t>
+        <w:t xml:space="preserve">       </w:t>
       </w:r>
       <w:r>
         <w:rPr>
@@ -1078,6 +954,14 @@
           <w:szCs w:val="24"/>
         </w:rPr>
         <w:t xml:space="preserve">= </w:t>
+      </w:r>
+      <w:r>
+        <w:rPr>
+          <w:rFonts w:asciiTheme="majorHAnsi" w:hAnsiTheme="majorHAnsi"/>
+          <w:sz w:val="24"/>
+          <w:szCs w:val="24"/>
+        </w:rPr>
+        <w:t>{{size_factor}}</w:t>
       </w:r>
       <w:r>
         <w:rPr>
@@ -1104,25 +988,7 @@
           <w:sz w:val="24"/>
           <w:szCs w:val="24"/>
         </w:rPr>
-        <w:t>)  = {{</w:t>
-      </w:r>
-      <w:proofErr w:type="spellStart"/>
-      <w:r>
-        <w:rPr>
-          <w:rFonts w:asciiTheme="majorHAnsi" w:hAnsiTheme="majorHAnsi"/>
-          <w:sz w:val="24"/>
-          <w:szCs w:val="24"/>
-        </w:rPr>
-        <w:t>radial_factor</w:t>
-      </w:r>
-      <w:proofErr w:type="spellEnd"/>
-      <w:r>
-        <w:rPr>
-          <w:rFonts w:asciiTheme="majorHAnsi" w:hAnsiTheme="majorHAnsi"/>
-          <w:sz w:val="24"/>
-          <w:szCs w:val="24"/>
-        </w:rPr>
-        <w:t>}}</w:t>
+        <w:t>)  = {{radial_factor}}</w:t>
       </w:r>
       <w:r>
         <w:rPr>
@@ -1165,25 +1031,7 @@
           <w:sz w:val="24"/>
           <w:szCs w:val="24"/>
         </w:rPr>
-        <w:t>= {{</w:t>
-      </w:r>
-      <w:proofErr w:type="spellStart"/>
-      <w:r>
-        <w:rPr>
-          <w:rFonts w:asciiTheme="majorHAnsi" w:hAnsiTheme="majorHAnsi"/>
-          <w:sz w:val="24"/>
-          <w:szCs w:val="24"/>
-        </w:rPr>
-        <w:t>axial_factor</w:t>
-      </w:r>
-      <w:proofErr w:type="spellEnd"/>
-      <w:r>
-        <w:rPr>
-          <w:rFonts w:asciiTheme="majorHAnsi" w:hAnsiTheme="majorHAnsi"/>
-          <w:sz w:val="24"/>
-          <w:szCs w:val="24"/>
-        </w:rPr>
-        <w:t>}}</w:t>
+        <w:t>= {{axial_factor}}</w:t>
       </w:r>
       <w:r>
         <w:rPr>
@@ -1238,7 +1086,6 @@
         </w:rPr>
         <w:t>(</w:t>
       </w:r>
-      <w:proofErr w:type="gramStart"/>
       <w:r>
         <w:rPr>
           <w:rFonts w:asciiTheme="majorHAnsi" w:hAnsiTheme="majorHAnsi"/>
@@ -1263,18 +1110,8 @@
           <w:sz w:val="24"/>
           <w:szCs w:val="24"/>
         </w:rPr>
-        <w:t>=</w:t>
-      </w:r>
-      <w:proofErr w:type="gramEnd"/>
-      <w:r>
-        <w:rPr>
-          <w:rFonts w:asciiTheme="majorHAnsi" w:hAnsiTheme="majorHAnsi"/>
-          <w:sz w:val="24"/>
-          <w:szCs w:val="24"/>
-        </w:rPr>
-        <w:t xml:space="preserve"> </w:t>
-      </w:r>
-      <w:proofErr w:type="spellStart"/>
+        <w:t xml:space="preserve">= </w:t>
+      </w:r>
       <w:r>
         <w:rPr>
           <w:rFonts w:asciiTheme="majorHAnsi" w:hAnsiTheme="majorHAnsi"/>
@@ -1303,7 +1140,6 @@
         </w:rPr>
         <w:t>Fr</w:t>
       </w:r>
-      <w:proofErr w:type="spellEnd"/>
       <w:r>
         <w:rPr>
           <w:rFonts w:asciiTheme="majorHAnsi" w:hAnsiTheme="majorHAnsi"/>
@@ -1312,7 +1148,6 @@
         </w:rPr>
         <w:t xml:space="preserve"> + </w:t>
       </w:r>
-      <w:proofErr w:type="spellStart"/>
       <w:r>
         <w:rPr>
           <w:rFonts w:asciiTheme="majorHAnsi" w:hAnsiTheme="majorHAnsi"/>
@@ -1341,7 +1176,6 @@
         </w:rPr>
         <w:t>Fa</w:t>
       </w:r>
-      <w:proofErr w:type="spellEnd"/>
       <w:r>
         <w:rPr>
           <w:rFonts w:asciiTheme="majorHAnsi" w:hAnsiTheme="majorHAnsi"/>
@@ -1405,25 +1239,7 @@
           <w:sz w:val="24"/>
           <w:szCs w:val="24"/>
         </w:rPr>
-        <w:t>= ({{</w:t>
-      </w:r>
-      <w:proofErr w:type="spellStart"/>
-      <w:r>
-        <w:rPr>
-          <w:rFonts w:asciiTheme="majorHAnsi" w:hAnsiTheme="majorHAnsi"/>
-          <w:sz w:val="24"/>
-          <w:szCs w:val="24"/>
-        </w:rPr>
-        <w:t>radial_factor</w:t>
-      </w:r>
-      <w:proofErr w:type="spellEnd"/>
-      <w:r>
-        <w:rPr>
-          <w:rFonts w:asciiTheme="majorHAnsi" w:hAnsiTheme="majorHAnsi"/>
-          <w:sz w:val="24"/>
-          <w:szCs w:val="24"/>
-        </w:rPr>
-        <w:t xml:space="preserve">}} </w:t>
+        <w:t xml:space="preserve">= ({{radial_factor}} </w:t>
       </w:r>
       <w:r>
         <w:rPr>
@@ -1439,43 +1255,7 @@
           <w:sz w:val="24"/>
           <w:szCs w:val="24"/>
         </w:rPr>
-        <w:t>{{</w:t>
-      </w:r>
-      <w:proofErr w:type="spellStart"/>
-      <w:r>
-        <w:rPr>
-          <w:rFonts w:asciiTheme="majorHAnsi" w:hAnsiTheme="majorHAnsi"/>
-          <w:sz w:val="24"/>
-          <w:szCs w:val="24"/>
-        </w:rPr>
-        <w:t>radial_load</w:t>
-      </w:r>
-      <w:proofErr w:type="spellEnd"/>
-      <w:r>
-        <w:rPr>
-          <w:rFonts w:asciiTheme="majorHAnsi" w:hAnsiTheme="majorHAnsi"/>
-          <w:sz w:val="24"/>
-          <w:szCs w:val="24"/>
-        </w:rPr>
-        <w:t>}}) + ({{</w:t>
-      </w:r>
-      <w:proofErr w:type="spellStart"/>
-      <w:r>
-        <w:rPr>
-          <w:rFonts w:asciiTheme="majorHAnsi" w:hAnsiTheme="majorHAnsi"/>
-          <w:sz w:val="24"/>
-          <w:szCs w:val="24"/>
-        </w:rPr>
-        <w:t>axial_factor</w:t>
-      </w:r>
-      <w:proofErr w:type="spellEnd"/>
-      <w:r>
-        <w:rPr>
-          <w:rFonts w:asciiTheme="majorHAnsi" w:hAnsiTheme="majorHAnsi"/>
-          <w:sz w:val="24"/>
-          <w:szCs w:val="24"/>
-        </w:rPr>
-        <w:t xml:space="preserve">}} </w:t>
+        <w:t xml:space="preserve">{{radial_load}}) + ({{axial_factor}} </w:t>
       </w:r>
       <w:r>
         <w:rPr>
@@ -1491,25 +1271,7 @@
           <w:sz w:val="24"/>
           <w:szCs w:val="24"/>
         </w:rPr>
-        <w:t>{{</w:t>
-      </w:r>
-      <w:proofErr w:type="spellStart"/>
-      <w:r>
-        <w:rPr>
-          <w:rFonts w:asciiTheme="majorHAnsi" w:hAnsiTheme="majorHAnsi"/>
-          <w:sz w:val="24"/>
-          <w:szCs w:val="24"/>
-        </w:rPr>
-        <w:t>axial_load</w:t>
-      </w:r>
-      <w:proofErr w:type="spellEnd"/>
-      <w:r>
-        <w:rPr>
-          <w:rFonts w:asciiTheme="majorHAnsi" w:hAnsiTheme="majorHAnsi"/>
-          <w:sz w:val="24"/>
-          <w:szCs w:val="24"/>
-        </w:rPr>
-        <w:t>}})</w:t>
+        <w:t>{{axial_load}})</w:t>
       </w:r>
       <w:r>
         <w:rPr>
@@ -1590,25 +1352,7 @@
           <w:sz w:val="24"/>
           <w:szCs w:val="24"/>
         </w:rPr>
-        <w:t>{{</w:t>
-      </w:r>
-      <w:proofErr w:type="spellStart"/>
-      <w:r>
-        <w:rPr>
-          <w:rFonts w:asciiTheme="majorHAnsi" w:hAnsiTheme="majorHAnsi"/>
-          <w:sz w:val="24"/>
-          <w:szCs w:val="24"/>
-        </w:rPr>
-        <w:t>equivalent_load</w:t>
-      </w:r>
-      <w:proofErr w:type="spellEnd"/>
-      <w:r>
-        <w:rPr>
-          <w:rFonts w:asciiTheme="majorHAnsi" w:hAnsiTheme="majorHAnsi"/>
-          <w:sz w:val="24"/>
-          <w:szCs w:val="24"/>
-        </w:rPr>
-        <w:t>}}</w:t>
+        <w:t>{{equivalent_load}}</w:t>
       </w:r>
       <w:r>
         <w:rPr>
@@ -1665,23 +1409,13 @@
         </w:rPr>
         <w:t>0</w:t>
       </w:r>
-      <w:proofErr w:type="gramStart"/>
-      <w:r>
-        <w:rPr>
-          <w:rFonts w:asciiTheme="majorHAnsi" w:hAnsiTheme="majorHAnsi"/>
-          <w:sz w:val="24"/>
-          <w:szCs w:val="24"/>
-        </w:rPr>
-        <w:t>)  =</w:t>
-      </w:r>
-      <w:proofErr w:type="gramEnd"/>
-      <w:r>
-        <w:rPr>
-          <w:rFonts w:asciiTheme="majorHAnsi" w:hAnsiTheme="majorHAnsi"/>
-          <w:sz w:val="24"/>
-          <w:szCs w:val="24"/>
-        </w:rPr>
-        <w:t xml:space="preserve"> </w:t>
+      <w:r>
+        <w:rPr>
+          <w:rFonts w:asciiTheme="majorHAnsi" w:hAnsiTheme="majorHAnsi"/>
+          <w:sz w:val="24"/>
+          <w:szCs w:val="24"/>
+        </w:rPr>
+        <w:t xml:space="preserve">)  = </w:t>
       </w:r>
       <w:r>
         <w:rPr>
@@ -1717,7 +1451,6 @@
         </w:rPr>
         <w:t xml:space="preserve"> </w:t>
       </w:r>
-      <w:proofErr w:type="spellStart"/>
       <w:r>
         <w:rPr>
           <w:rFonts w:asciiTheme="majorHAnsi" w:hAnsiTheme="majorHAnsi" w:cs="Times New Roman"/>
@@ -1728,7 +1461,6 @@
         </w:rPr>
         <w:t>i</w:t>
       </w:r>
-      <w:proofErr w:type="spellEnd"/>
       <w:r>
         <w:rPr>
           <w:rFonts w:asciiTheme="majorHAnsi" w:hAnsiTheme="majorHAnsi"/>
@@ -1840,25 +1572,23 @@
           <w:sz w:val="24"/>
           <w:szCs w:val="24"/>
         </w:rPr>
-        <w:t>{{</w:t>
-      </w:r>
-      <w:proofErr w:type="spellStart"/>
+        <w:t>{{number_of_rows}}</w:t>
+      </w:r>
       <w:r>
         <w:rPr>
           <w:rFonts w:ascii="Aptos" w:hAnsi="Aptos"/>
           <w:sz w:val="24"/>
           <w:szCs w:val="24"/>
         </w:rPr>
-        <w:t>number_of_rows</w:t>
-      </w:r>
-      <w:proofErr w:type="spellEnd"/>
+        <w:t xml:space="preserve"> ×</w:t>
+      </w:r>
       <w:r>
         <w:rPr>
           <w:rFonts w:ascii="Aptos" w:hAnsi="Aptos"/>
           <w:sz w:val="24"/>
           <w:szCs w:val="24"/>
         </w:rPr>
-        <w:t>}}</w:t>
+        <w:t xml:space="preserve"> </w:t>
       </w:r>
       <w:r>
         <w:rPr>
@@ -1866,41 +1596,7 @@
           <w:sz w:val="24"/>
           <w:szCs w:val="24"/>
         </w:rPr>
-        <w:t xml:space="preserve"> ×</w:t>
-      </w:r>
-      <w:r>
-        <w:rPr>
-          <w:rFonts w:ascii="Aptos" w:hAnsi="Aptos"/>
-          <w:sz w:val="24"/>
-          <w:szCs w:val="24"/>
-        </w:rPr>
-        <w:t xml:space="preserve"> </w:t>
-      </w:r>
-      <w:r>
-        <w:rPr>
-          <w:rFonts w:ascii="Aptos" w:hAnsi="Aptos"/>
-          <w:sz w:val="24"/>
-          <w:szCs w:val="24"/>
-        </w:rPr>
-        <w:t>{{</w:t>
-      </w:r>
-      <w:proofErr w:type="spellStart"/>
-      <w:r>
-        <w:rPr>
-          <w:rFonts w:ascii="Aptos" w:hAnsi="Aptos"/>
-          <w:sz w:val="24"/>
-          <w:szCs w:val="24"/>
-        </w:rPr>
-        <w:t>ball_diameter</w:t>
-      </w:r>
-      <w:proofErr w:type="spellEnd"/>
-      <w:r>
-        <w:rPr>
-          <w:rFonts w:ascii="Aptos" w:hAnsi="Aptos"/>
-          <w:sz w:val="24"/>
-          <w:szCs w:val="24"/>
-        </w:rPr>
-        <w:t>}</w:t>
+        <w:t>{{ball_diameter}</w:t>
       </w:r>
       <w:r>
         <w:rPr>
@@ -1965,25 +1661,7 @@
           <w:sz w:val="24"/>
           <w:szCs w:val="24"/>
         </w:rPr>
-        <w:t xml:space="preserve"> {{</w:t>
-      </w:r>
-      <w:proofErr w:type="spellStart"/>
-      <w:r>
-        <w:rPr>
-          <w:rFonts w:asciiTheme="majorHAnsi" w:hAnsiTheme="majorHAnsi"/>
-          <w:sz w:val="24"/>
-          <w:szCs w:val="24"/>
-        </w:rPr>
-        <w:t>load_rating</w:t>
-      </w:r>
-      <w:proofErr w:type="spellEnd"/>
-      <w:r>
-        <w:rPr>
-          <w:rFonts w:asciiTheme="majorHAnsi" w:hAnsiTheme="majorHAnsi"/>
-          <w:sz w:val="24"/>
-          <w:szCs w:val="24"/>
-        </w:rPr>
-        <w:t>}}</w:t>
+        <w:t xml:space="preserve"> {{load_rating}}</w:t>
       </w:r>
       <w:r>
         <w:rPr>
@@ -2408,7 +2086,6 @@
         </w:rPr>
         <w:t xml:space="preserve"> </w:t>
       </w:r>
-      <w:proofErr w:type="spellStart"/>
       <w:r>
         <w:rPr>
           <w:rFonts w:asciiTheme="majorHAnsi" w:hAnsiTheme="majorHAnsi" w:cs="Times New Roman"/>
@@ -2419,7 +2096,6 @@
         </w:rPr>
         <w:t>L_h</w:t>
       </w:r>
-      <w:proofErr w:type="spellEnd"/>
       <w:r>
         <w:rPr>
           <w:rFonts w:asciiTheme="majorHAnsi" w:hAnsiTheme="majorHAnsi"/>
@@ -2478,25 +2154,7 @@
           <w:sz w:val="24"/>
           <w:szCs w:val="24"/>
         </w:rPr>
-        <w:t>{{</w:t>
-      </w:r>
-      <w:proofErr w:type="spellStart"/>
-      <w:r>
-        <w:rPr>
-          <w:rFonts w:asciiTheme="majorHAnsi" w:hAnsiTheme="majorHAnsi" w:cs="Times New Roman"/>
-          <w:sz w:val="24"/>
-          <w:szCs w:val="24"/>
-        </w:rPr>
-        <w:t>required_life</w:t>
-      </w:r>
-      <w:proofErr w:type="spellEnd"/>
-      <w:r>
-        <w:rPr>
-          <w:rFonts w:asciiTheme="majorHAnsi" w:hAnsiTheme="majorHAnsi" w:cs="Times New Roman"/>
-          <w:sz w:val="24"/>
-          <w:szCs w:val="24"/>
-        </w:rPr>
-        <w:t>}} × {{speed}}</w:t>
+        <w:t>{{required_life}} × {{speed}}</w:t>
       </w:r>
       <w:r>
         <w:rPr>
@@ -2600,44 +2258,16 @@
           <w:sz w:val="24"/>
           <w:szCs w:val="24"/>
         </w:rPr>
-        <w:t>{{</w:t>
-      </w:r>
-      <w:proofErr w:type="spellStart"/>
-      <w:r>
-        <w:rPr>
-          <w:rFonts w:asciiTheme="majorHAnsi" w:hAnsiTheme="majorHAnsi"/>
-          <w:sz w:val="24"/>
-          <w:szCs w:val="24"/>
-        </w:rPr>
-        <w:t>life_million_rev</w:t>
-      </w:r>
-      <w:proofErr w:type="spellEnd"/>
-      <w:r>
-        <w:rPr>
-          <w:rFonts w:asciiTheme="majorHAnsi" w:hAnsiTheme="majorHAnsi"/>
-          <w:sz w:val="24"/>
-          <w:szCs w:val="24"/>
-        </w:rPr>
-        <w:t>}}</w:t>
-      </w:r>
-      <w:r>
-        <w:rPr>
-          <w:rFonts w:asciiTheme="majorHAnsi" w:hAnsiTheme="majorHAnsi"/>
-          <w:sz w:val="24"/>
-          <w:szCs w:val="24"/>
-        </w:rPr>
-        <w:t xml:space="preserve"> million </w:t>
-      </w:r>
-      <w:proofErr w:type="gramStart"/>
-      <w:r>
-        <w:rPr>
-          <w:rFonts w:asciiTheme="majorHAnsi" w:hAnsiTheme="majorHAnsi"/>
-          <w:sz w:val="24"/>
-          <w:szCs w:val="24"/>
-        </w:rPr>
-        <w:t>rev</w:t>
-      </w:r>
-      <w:proofErr w:type="gramEnd"/>
+        <w:t>{{life_million_rev}}</w:t>
+      </w:r>
+      <w:r>
+        <w:rPr>
+          <w:rFonts w:asciiTheme="majorHAnsi" w:hAnsiTheme="majorHAnsi"/>
+          <w:sz w:val="24"/>
+          <w:szCs w:val="24"/>
+        </w:rPr>
+        <w:t xml:space="preserve"> million rev</w:t>
+      </w:r>
     </w:p>
     <w:p>
       <w:pPr>
@@ -2666,23 +2296,13 @@
         </w:rPr>
         <w:t>C</w:t>
       </w:r>
-      <w:proofErr w:type="gramStart"/>
-      <w:r>
-        <w:rPr>
-          <w:rFonts w:asciiTheme="majorHAnsi" w:hAnsiTheme="majorHAnsi"/>
-          <w:sz w:val="24"/>
-          <w:szCs w:val="24"/>
-        </w:rPr>
-        <w:t>)  =</w:t>
-      </w:r>
-      <w:proofErr w:type="gramEnd"/>
-      <w:r>
-        <w:rPr>
-          <w:rFonts w:asciiTheme="majorHAnsi" w:hAnsiTheme="majorHAnsi"/>
-          <w:sz w:val="24"/>
-          <w:szCs w:val="24"/>
-        </w:rPr>
-        <w:t xml:space="preserve"> </w:t>
+      <w:r>
+        <w:rPr>
+          <w:rFonts w:asciiTheme="majorHAnsi" w:hAnsiTheme="majorHAnsi"/>
+          <w:sz w:val="24"/>
+          <w:szCs w:val="24"/>
+        </w:rPr>
+        <w:t xml:space="preserve">)  = </w:t>
       </w:r>
       <w:r>
         <w:rPr>
@@ -2775,25 +2395,7 @@
           <w:sz w:val="24"/>
           <w:szCs w:val="24"/>
         </w:rPr>
-        <w:t>{{</w:t>
-      </w:r>
-      <w:proofErr w:type="spellStart"/>
-      <w:r>
-        <w:rPr>
-          <w:rFonts w:asciiTheme="majorHAnsi" w:hAnsiTheme="majorHAnsi"/>
-          <w:sz w:val="24"/>
-          <w:szCs w:val="24"/>
-        </w:rPr>
-        <w:t>equivalent_load</w:t>
-      </w:r>
-      <w:proofErr w:type="spellEnd"/>
-      <w:r>
-        <w:rPr>
-          <w:rFonts w:asciiTheme="majorHAnsi" w:hAnsiTheme="majorHAnsi"/>
-          <w:sz w:val="24"/>
-          <w:szCs w:val="24"/>
-        </w:rPr>
-        <w:t>}}</w:t>
+        <w:t>{{equivalent_load}}</w:t>
       </w:r>
       <w:r>
         <w:rPr>
@@ -2817,18 +2419,8 @@
           <w:sz w:val="24"/>
           <w:szCs w:val="24"/>
         </w:rPr>
-        <w:t>{{</w:t>
-      </w:r>
-      <w:proofErr w:type="spellStart"/>
-      <w:r>
-        <w:rPr>
-          <w:rFonts w:asciiTheme="majorHAnsi" w:hAnsiTheme="majorHAnsi"/>
-          <w:sz w:val="24"/>
-          <w:szCs w:val="24"/>
-        </w:rPr>
-        <w:t>life_million_rev</w:t>
-      </w:r>
-      <w:proofErr w:type="spellEnd"/>
+        <w:t>{{life_million_rev</w:t>
+      </w:r>
       <w:r>
         <w:rPr>
           <w:rFonts w:asciiTheme="majorHAnsi" w:hAnsiTheme="majorHAnsi"/>
@@ -2884,25 +2476,7 @@
           <w:sz w:val="24"/>
           <w:szCs w:val="24"/>
         </w:rPr>
-        <w:t>{{</w:t>
-      </w:r>
-      <w:proofErr w:type="spellStart"/>
-      <w:r>
-        <w:rPr>
-          <w:rFonts w:asciiTheme="majorHAnsi" w:hAnsiTheme="majorHAnsi"/>
-          <w:sz w:val="24"/>
-          <w:szCs w:val="24"/>
-        </w:rPr>
-        <w:t>required_dynamic_capacity</w:t>
-      </w:r>
-      <w:proofErr w:type="spellEnd"/>
-      <w:r>
-        <w:rPr>
-          <w:rFonts w:asciiTheme="majorHAnsi" w:hAnsiTheme="majorHAnsi"/>
-          <w:sz w:val="24"/>
-          <w:szCs w:val="24"/>
-        </w:rPr>
-        <w:t>}}</w:t>
+        <w:t>{{required_dynamic_capacity}}</w:t>
       </w:r>
       <w:r>
         <w:rPr>
@@ -3117,25 +2691,7 @@
                 <w:sz w:val="24"/>
                 <w:szCs w:val="24"/>
               </w:rPr>
-              <w:t>{{</w:t>
-            </w:r>
-            <w:proofErr w:type="spellStart"/>
-            <w:r>
-              <w:rPr>
-                <w:rFonts w:ascii="Aptos" w:hAnsi="Aptos"/>
-                <w:sz w:val="24"/>
-                <w:szCs w:val="24"/>
-              </w:rPr>
-              <w:t>outer_diameter</w:t>
-            </w:r>
-            <w:proofErr w:type="spellEnd"/>
-            <w:r>
-              <w:rPr>
-                <w:rFonts w:ascii="Aptos" w:hAnsi="Aptos"/>
-                <w:sz w:val="24"/>
-                <w:szCs w:val="24"/>
-              </w:rPr>
-              <w:t>}}</w:t>
+              <w:t>{{outer_diameter}}</w:t>
             </w:r>
           </w:p>
         </w:tc>
@@ -3231,25 +2787,7 @@
                 <w:sz w:val="24"/>
                 <w:szCs w:val="24"/>
               </w:rPr>
-              <w:t>{{</w:t>
-            </w:r>
-            <w:proofErr w:type="spellStart"/>
-            <w:r>
-              <w:rPr>
-                <w:rFonts w:ascii="Aptos" w:hAnsi="Aptos"/>
-                <w:sz w:val="24"/>
-                <w:szCs w:val="24"/>
-              </w:rPr>
-              <w:t>inner_diameter</w:t>
-            </w:r>
-            <w:proofErr w:type="spellEnd"/>
-            <w:r>
-              <w:rPr>
-                <w:rFonts w:ascii="Aptos" w:hAnsi="Aptos"/>
-                <w:sz w:val="24"/>
-                <w:szCs w:val="24"/>
-              </w:rPr>
-              <w:t>}}</w:t>
+              <w:t>{{inner_diameter}}</w:t>
             </w:r>
           </w:p>
         </w:tc>
@@ -3449,25 +2987,7 @@
                 <w:sz w:val="24"/>
                 <w:szCs w:val="24"/>
               </w:rPr>
-              <w:t>{{</w:t>
-            </w:r>
-            <w:proofErr w:type="spellStart"/>
-            <w:r>
-              <w:rPr>
-                <w:rFonts w:ascii="Aptos" w:hAnsi="Aptos"/>
-                <w:sz w:val="24"/>
-                <w:szCs w:val="24"/>
-              </w:rPr>
-              <w:t>number_of_balls</w:t>
-            </w:r>
-            <w:proofErr w:type="spellEnd"/>
-            <w:r>
-              <w:rPr>
-                <w:rFonts w:ascii="Aptos" w:hAnsi="Aptos"/>
-                <w:sz w:val="24"/>
-                <w:szCs w:val="24"/>
-              </w:rPr>
-              <w:t>}}</w:t>
+              <w:t>{{number_of_balls}}</w:t>
             </w:r>
           </w:p>
         </w:tc>

</xml_diff>